<commit_message>
docs: soften model item in owner summary (EN + ZH)
The configured AI model is valid and working, so reframe the model
refresh as an optional enhancement rather than a reliability fix,
matching the corrected brief. Note the older SDK worth updating too.

Co-Authored-By: Claude Opus 4.8 (1M context) <noreply@anthropic.com>
</commit_message>
<xml_diff>
--- a/AFFAIRS-Improvements-Owner-Summary-EN-ZH.docx
+++ b/AFFAIRS-Improvements-Owner-Summary-EN-ZH.docx
@@ -184,26 +184,26 @@
               <w:spacing w:after="40"/>
             </w:pPr>
             <w:r>
-              <w:t xml:space="preserve">Refresh the AI model setting</w:t>
-            </w:r>
-          </w:p>
-        </w:tc>
-        <w:tc>
-          <w:tcPr>
-            <w:tcW w:w="4680" w:type="dxa"/>
-            <w:tcBorders>
-              <w:top w:val="single" w:sz="4" w:color="BBBBBB"/>
-              <w:bottom w:val="single" w:sz="4" w:color="BBBBBB"/>
-              <w:left w:val="single" w:sz="4" w:color="BBBBBB"/>
-              <w:right w:val="single" w:sz="4" w:color="BBBBBB"/>
-            </w:tcBorders>
-          </w:tcPr>
-          <w:p>
-            <w:pPr>
-              <w:spacing w:after="40"/>
-            </w:pPr>
-            <w:r>
-              <w:t xml:space="preserve">The AI features point at an older model name. Update it so they keep working reliably, and consider a cheaper AI model for the high-volume parts (scoring, Q&amp;A) to lower running cost.</w:t>
+              <w:t xml:space="preserve">Consider a newer AI model (optional)</w:t>
+            </w:r>
+          </w:p>
+        </w:tc>
+        <w:tc>
+          <w:tcPr>
+            <w:tcW w:w="4680" w:type="dxa"/>
+            <w:tcBorders>
+              <w:top w:val="single" w:sz="4" w:color="BBBBBB"/>
+              <w:bottom w:val="single" w:sz="4" w:color="BBBBBB"/>
+              <w:left w:val="single" w:sz="4" w:color="BBBBBB"/>
+              <w:right w:val="single" w:sz="4" w:color="BBBBBB"/>
+            </w:tcBorders>
+          </w:tcPr>
+          <w:p>
+            <w:pPr>
+              <w:spacing w:after="40"/>
+            </w:pPr>
+            <w:r>
+              <w:t xml:space="preserve">The AI features use a valid but older-generation AI model — everything works as-is today, so this is an enhancement, not a fix. Moving to the current model can improve answer quality, and using a cheaper model for the high-volume parts (scoring, Q&amp;A) can lower running cost. An older software library used to talk to the AI is worth updating at the same time, then re-testing.</w:t>
             </w:r>
           </w:p>
         </w:tc>
@@ -1144,26 +1144,26 @@
               <w:spacing w:after="40"/>
             </w:pPr>
             <w:r>
-              <w:t xml:space="preserve">更新 AI 模型设置</w:t>
-            </w:r>
-          </w:p>
-        </w:tc>
-        <w:tc>
-          <w:tcPr>
-            <w:tcW w:w="4680" w:type="dxa"/>
-            <w:tcBorders>
-              <w:top w:val="single" w:sz="4" w:color="BBBBBB"/>
-              <w:bottom w:val="single" w:sz="4" w:color="BBBBBB"/>
-              <w:left w:val="single" w:sz="4" w:color="BBBBBB"/>
-              <w:right w:val="single" w:sz="4" w:color="BBBBBB"/>
-            </w:tcBorders>
-          </w:tcPr>
-          <w:p>
-            <w:pPr>
-              <w:spacing w:after="40"/>
-            </w:pPr>
-            <w:r>
-              <w:t xml:space="preserve">各项 AI 功能目前指向一个较旧的模型名称。请更新它以保证功能稳定运行；同时可考虑对高频使用的部分（评分、问答）改用更经济的 AI 模型，以降低运行成本。</w:t>
+              <w:t xml:space="preserve">考虑改用更新的 AI 模型（可选）</w:t>
+            </w:r>
+          </w:p>
+        </w:tc>
+        <w:tc>
+          <w:tcPr>
+            <w:tcW w:w="4680" w:type="dxa"/>
+            <w:tcBorders>
+              <w:top w:val="single" w:sz="4" w:color="BBBBBB"/>
+              <w:bottom w:val="single" w:sz="4" w:color="BBBBBB"/>
+              <w:left w:val="single" w:sz="4" w:color="BBBBBB"/>
+              <w:right w:val="single" w:sz="4" w:color="BBBBBB"/>
+            </w:tcBorders>
+          </w:tcPr>
+          <w:p>
+            <w:pPr>
+              <w:spacing w:after="40"/>
+            </w:pPr>
+            <w:r>
+              <w:t xml:space="preserve">各项 AI 功能目前使用的是一个有效但较旧版本的 AI 模型 —— 目前一切正常，因此这属于优化而非修复。改用当前最新模型可以提升回答质量；对高频使用的部分（评分、问答）改用更经济的模型可以降低运行成本。用于对接 AI 的一个较旧的软件库也值得一并更新，然后重新测试。</w:t>
             </w:r>
           </w:p>
         </w:tc>

</xml_diff>